<commit_message>
docs(chapters): eliminate duplicate diagrams and add landscape fold-out editions for Chapter 3 & 4
</commit_message>
<xml_diff>
--- a/docs/chapters/CHAPTER 3.docx
+++ b/docs/chapters/CHAPTER 3.docx
@@ -6918,76 +6918,6 @@
     </w:tbl>
     <w:p>
       <w:pPr>
-        <w:spacing w:after="60"/>
-        <w:rPr>
-          <w:b/>
-          <w:bCs/>
-        </w:rPr>
-      </w:pPr>
-      <w:r>
-        <w:rPr>
-          <w:noProof/>
-        </w:rPr>
-        <w:lastRenderedPageBreak/>
-        <w:drawing>
-          <wp:anchor distT="0" distB="0" distL="114300" distR="114300" simplePos="0" relativeHeight="251661312" behindDoc="0" locked="0" layoutInCell="1" allowOverlap="1" wp14:anchorId="2DD56504" wp14:editId="222C5AC5">
-            <wp:simplePos x="0" y="0"/>
-            <wp:positionH relativeFrom="page">
-              <wp:align>left</wp:align>
-            </wp:positionH>
-            <wp:positionV relativeFrom="paragraph">
-              <wp:posOffset>304800</wp:posOffset>
-            </wp:positionV>
-            <wp:extent cx="7575302" cy="3718560"/>
-            <wp:effectExtent l="0" t="0" r="6985" b="0"/>
-            <wp:wrapSquare wrapText="bothSides"/>
-            <wp:docPr id="2139412770" name="Picture 2139412770"/>
-            <wp:cNvGraphicFramePr>
-              <a:graphicFrameLocks xmlns:a="http://schemas.openxmlformats.org/drawingml/2006/main" noChangeAspect="1"/>
-            </wp:cNvGraphicFramePr>
-            <a:graphic xmlns:a="http://schemas.openxmlformats.org/drawingml/2006/main">
-              <a:graphicData uri="http://schemas.openxmlformats.org/drawingml/2006/picture">
-                <pic:pic xmlns:pic="http://schemas.openxmlformats.org/drawingml/2006/picture">
-                  <pic:nvPicPr>
-                    <pic:cNvPr id="0" name="gantt_chart_phase1.png"/>
-                    <pic:cNvPicPr/>
-                  </pic:nvPicPr>
-                  <pic:blipFill>
-                    <a:blip r:embed="rId6" cstate="print">
-                      <a:extLst>
-                        <a:ext uri="{28A0092B-C50C-407E-A947-70E740481C1C}">
-                          <a14:useLocalDpi xmlns:a14="http://schemas.microsoft.com/office/drawing/2010/main" val="0"/>
-                        </a:ext>
-                      </a:extLst>
-                    </a:blip>
-                    <a:stretch>
-                      <a:fillRect/>
-                    </a:stretch>
-                  </pic:blipFill>
-                  <pic:spPr>
-                    <a:xfrm>
-                      <a:off x="0" y="0"/>
-                      <a:ext cx="7575302" cy="3718560"/>
-                    </a:xfrm>
-                    <a:prstGeom prst="rect">
-                      <a:avLst/>
-                    </a:prstGeom>
-                  </pic:spPr>
-                </pic:pic>
-              </a:graphicData>
-            </a:graphic>
-            <wp14:sizeRelH relativeFrom="margin">
-              <wp14:pctWidth>0</wp14:pctWidth>
-            </wp14:sizeRelH>
-            <wp14:sizeRelV relativeFrom="margin">
-              <wp14:pctHeight>0</wp14:pctHeight>
-            </wp14:sizeRelV>
-          </wp:anchor>
-        </w:drawing>
-      </w:r>
-    </w:p>
-    <w:p>
-      <w:pPr>
         <w:spacing w:before="160" w:after="80"/>
         <w:jc w:val="center"/>
         <w:rPr>
@@ -7000,7 +6930,7 @@
         <w:drawing>
           <wp:inline xmlns:a="http://schemas.openxmlformats.org/drawingml/2006/main" xmlns:pic="http://schemas.openxmlformats.org/drawingml/2006/picture">
             <wp:extent cx="5852160" cy="2845913"/>
-            <wp:docPr id="2139412773" name="Picture 2139412773"/>
+            <wp:docPr id="2139412775" name="Picture 2139412775"/>
             <wp:cNvGraphicFramePr>
               <a:graphicFrameLocks noChangeAspect="1"/>
             </wp:cNvGraphicFramePr>
@@ -7008,7 +6938,7 @@
               <a:graphicData uri="http://schemas.openxmlformats.org/drawingml/2006/picture">
                 <pic:pic>
                   <pic:nvPicPr>
-                    <pic:cNvPr id="0" name="gantt_chart_phase1.png"/>
+                    <pic:cNvPr id="0" name="image.png"/>
                     <pic:cNvPicPr/>
                   </pic:nvPicPr>
                   <pic:blipFill>
@@ -7044,61 +6974,6 @@
         <w:rPr>
           <w:noProof/>
         </w:rPr>
-        <w:drawing>
-          <wp:anchor distT="0" distB="0" distL="114300" distR="114300" simplePos="0" relativeHeight="251662336" behindDoc="0" locked="0" layoutInCell="1" allowOverlap="1" wp14:anchorId="51833EE8" wp14:editId="7BBD2473">
-            <wp:simplePos x="0" y="0"/>
-            <wp:positionH relativeFrom="page">
-              <wp:align>left</wp:align>
-            </wp:positionH>
-            <wp:positionV relativeFrom="paragraph">
-              <wp:posOffset>507365</wp:posOffset>
-            </wp:positionV>
-            <wp:extent cx="7528560" cy="3230245"/>
-            <wp:effectExtent l="0" t="0" r="0" b="8255"/>
-            <wp:wrapSquare wrapText="bothSides"/>
-            <wp:docPr id="2139412771" name="Picture 2139412771"/>
-            <wp:cNvGraphicFramePr>
-              <a:graphicFrameLocks xmlns:a="http://schemas.openxmlformats.org/drawingml/2006/main" noChangeAspect="1"/>
-            </wp:cNvGraphicFramePr>
-            <a:graphic xmlns:a="http://schemas.openxmlformats.org/drawingml/2006/main">
-              <a:graphicData uri="http://schemas.openxmlformats.org/drawingml/2006/picture">
-                <pic:pic xmlns:pic="http://schemas.openxmlformats.org/drawingml/2006/picture">
-                  <pic:nvPicPr>
-                    <pic:cNvPr id="0" name="gantt_chart_phase2.png"/>
-                    <pic:cNvPicPr/>
-                  </pic:nvPicPr>
-                  <pic:blipFill>
-                    <a:blip r:embed="rId7" cstate="print">
-                      <a:extLst>
-                        <a:ext uri="{28A0092B-C50C-407E-A947-70E740481C1C}">
-                          <a14:useLocalDpi xmlns:a14="http://schemas.microsoft.com/office/drawing/2010/main" val="0"/>
-                        </a:ext>
-                      </a:extLst>
-                    </a:blip>
-                    <a:stretch>
-                      <a:fillRect/>
-                    </a:stretch>
-                  </pic:blipFill>
-                  <pic:spPr>
-                    <a:xfrm>
-                      <a:off x="0" y="0"/>
-                      <a:ext cx="7528560" cy="3230245"/>
-                    </a:xfrm>
-                    <a:prstGeom prst="rect">
-                      <a:avLst/>
-                    </a:prstGeom>
-                  </pic:spPr>
-                </pic:pic>
-              </a:graphicData>
-            </a:graphic>
-            <wp14:sizeRelH relativeFrom="margin">
-              <wp14:pctWidth>0</wp14:pctWidth>
-            </wp14:sizeRelH>
-            <wp14:sizeRelV relativeFrom="margin">
-              <wp14:pctHeight>0</wp14:pctHeight>
-            </wp14:sizeRelV>
-          </wp:anchor>
-        </w:drawing>
       </w:r>
       <w:r>
         <w:rPr>
@@ -7123,7 +6998,7 @@
         <w:drawing>
           <wp:inline xmlns:a="http://schemas.openxmlformats.org/drawingml/2006/main" xmlns:pic="http://schemas.openxmlformats.org/drawingml/2006/picture">
             <wp:extent cx="5852160" cy="2305014"/>
-            <wp:docPr id="2139412774" name="Picture 2139412774"/>
+            <wp:docPr id="2139412776" name="Picture 2139412776"/>
             <wp:cNvGraphicFramePr>
               <a:graphicFrameLocks noChangeAspect="1"/>
             </wp:cNvGraphicFramePr>
@@ -7131,7 +7006,7 @@
               <a:graphicData uri="http://schemas.openxmlformats.org/drawingml/2006/picture">
                 <pic:pic>
                   <pic:nvPicPr>
-                    <pic:cNvPr id="0" name="gantt_chart_phase2.png"/>
+                    <pic:cNvPr id="0" name="image.png"/>
                     <pic:cNvPicPr/>
                   </pic:nvPicPr>
                   <pic:blipFill>

</xml_diff>